<commit_message>
Manual: comandos aceitam maiuscula ou minuscula; remove __pycache__ do versionamento
</commit_message>
<xml_diff>
--- a/docs/ECOS94.docx
+++ b/docs/ECOS94.docx
@@ -3905,7 +3905,7 @@
           <w:b w:val="0"/>
           <w:i w:val="0"/>
         </w:rPr>
-        <w:t>O movimento usa apenas as setas do teclado. Os comandos sao MAIUSCULAS de proposito: assim nenhum comando disputa tecla com o movimento, e mantem tudo legivel mesmo com a fonte CP437 do DOS. As versoes minusculas estao disponiveis como atalho para os comandos mais usados.</w:t>
+        <w:t>O movimento usa apenas as setas do teclado. Como nenhuma letra move mais o jogador, cada comando funciona em MAIUSCULA ou em minuscula (B = b, U = u, L = l): nenhum comando disputa tecla com outro. O S tem o atalho P. E mantem tudo legivel mesmo com a fonte CP437 do DOS.</w:t>
       </w:r>
     </w:p>
     <w:tbl>
@@ -4097,7 +4097,7 @@
               <w:rPr>
                 <w:sz w:val="19"/>
               </w:rPr>
-              <w:t>Trancar a porta ao lado</w:t>
+              <w:t>Trancar uma porta ao lado</w:t>
             </w:r>
           </w:p>
         </w:tc>
@@ -4134,7 +4134,7 @@
               <w:rPr>
                 <w:sz w:val="19"/>
               </w:rPr>
-              <w:t>Destravar a porta ao lado</w:t>
+              <w:t>Destravar a porta trancada ao lado</w:t>
             </w:r>
           </w:p>
         </w:tc>

</xml_diff>

<commit_message>
feat: abertura narrativa e lore atualizada
- tres paginas de prologo no terminal e no navegador (H reabre, --skip-prologue pula)
- docs/LORE-ATUALIZADA.md como referencia; docs/LORE.md preservado
- manual aponta para a nova lore
- testes cobrem o prologo no terminal e no site
</commit_message>
<xml_diff>
--- a/docs/ECOS94.docx
+++ b/docs/ECOS94.docx
@@ -69,7 +69,7 @@
           <w:color w:val="444444"/>
           <w:sz w:val="18"/>
         </w:rPr>
-        <w:t>Versao 1.1 - jogo implementado e validado</w:t>
+        <w:t>Versao 1.2 - jogo implementado e validado</w:t>
       </w:r>
     </w:p>
     <w:p>
@@ -376,6 +376,26 @@
           <w:sz w:val="20"/>
         </w:rPr>
         <w:t>Caixa de ferramentas de validacao</w:t>
+      </w:r>
+    </w:p>
+    <w:p>
+      <w:pPr>
+        <w:spacing w:after="40"/>
+      </w:pPr>
+      <w:r>
+        <w:rPr>
+          <w:rFonts w:ascii="Consolas" w:hAnsi="Consolas"/>
+          <w:b/>
+          <w:color w:val="8A4B08"/>
+          <w:sz w:val="19"/>
+        </w:rPr>
+        <w:t xml:space="preserve">15.   </w:t>
+      </w:r>
+      <w:r>
+        <w:rPr>
+          <w:sz w:val="20"/>
+        </w:rPr>
+        <w:t>A historia de ECOS</w:t>
       </w:r>
     </w:p>
     <w:p>
@@ -4580,6 +4600,16 @@
       </w:r>
     </w:p>
     <w:p>
+      <w:pPr/>
+      <w:r>
+        <w:rPr>
+          <w:b w:val="0"/>
+          <w:i w:val="0"/>
+        </w:rPr>
+        <w:t>Antes do menu, tres telas de abertura apresentam o arquivo morto (qualquer tecla avanca, ESC pula, --skip-prologue desliga). A historia completa do subsolo esta em docs/LORE-ATUALIZADA.md.</w:t>
+      </w:r>
+    </w:p>
+    <w:p>
       <w:r>
         <w:rPr>
           <w:b w:val="0"/>
@@ -5573,6 +5603,34 @@
           </w:p>
         </w:tc>
       </w:tr>
+      <w:tr>
+        <w:tc>
+          <w:tcPr>
+            <w:tcW w:type="dxa" w:w="3744"/>
+          </w:tcPr>
+          <w:p>
+            <w:pPr>
+              <w:spacing w:after="40"/>
+            </w:pPr>
+            <w:r>
+              <w:t>--skip-prologue</w:t>
+            </w:r>
+          </w:p>
+        </w:tc>
+        <w:tc>
+          <w:tcPr>
+            <w:tcW w:type="dxa" w:w="5472"/>
+          </w:tcPr>
+          <w:p>
+            <w:pPr>
+              <w:spacing w:after="40"/>
+            </w:pPr>
+            <w:r>
+              <w:t>Pula a abertura narrativa de tres telas.</w:t>
+            </w:r>
+          </w:p>
+        </w:tc>
+      </w:tr>
     </w:tbl>
     <w:p>
       <w:pPr>
@@ -5819,6 +5877,321 @@
           <w:i w:val="0"/>
         </w:rPr>
         <w:t>O bot nao e o alvo: ele existe para provar que o jogo e completavel e para medir o quanto e dificil. Um humano com o RULER, as portas, o SHOCKER, os ROMs e a disciplina de nao fazer barulho faz bem melhor - o bot morre por descer direto, brigar com tudo e pingar demais.</w:t>
+      </w:r>
+    </w:p>
+    <w:p>
+      <w:pPr>
+        <w:pStyle w:val="Heading1"/>
+      </w:pPr>
+      <w:r>
+        <w:t>15. A historia de ECOS</w:t>
+      </w:r>
+    </w:p>
+    <w:p>
+      <w:pPr/>
+      <w:r>
+        <w:rPr>
+          <w:b w:val="0"/>
+        </w:rPr>
+        <w:t>Esta secao e ficcao de moldura: nenhuma regra do jogo depende dela. O texto completo, com a nota de canon que liga cada elemento ao codigo, esta em docs/LORE-ATUALIZADA.md; a primeira versao fica preservada em docs/LORE.md.</w:t>
+      </w:r>
+    </w:p>
+    <w:p>
+      <w:pPr>
+        <w:pStyle w:val="Heading2"/>
+      </w:pPr>
+      <w:r>
+        <w:t>15.1 O que era ECOS</w:t>
+      </w:r>
+    </w:p>
+    <w:p>
+      <w:pPr/>
+      <w:r>
+        <w:rPr>
+          <w:b w:val="0"/>
+        </w:rPr>
+        <w:t>A ECOS SYSTEMS nunca foi uma empresa grande. Era uma contratada de terceiro nivel, do tipo que aparece em licitacao so para preencher cota, e que em 1991 aceitou o unico trabalho que ninguem queria: administrar o arquivo morto de outra empresa, enterrado a dez setores de profundidade numa cavidade natural que ja existia antes de qualquer empreiteira chegar.</w:t>
+      </w:r>
+    </w:p>
+    <w:p>
+      <w:pPr/>
+      <w:r>
+        <w:rPr>
+          <w:b w:val="0"/>
+        </w:rPr>
+        <w:t>Chamava-se, nos papeis, Emergency Core Operations Substrate. Ninguem usava o nome. Os tecnicos da escavacao comecaram a chamar de ECOS porque era o que voltava quando se batia numa parede do poco: eco. O apelido ficou. O nome oficial nunca apareceu em lugar nenhum que importasse.</w:t>
+      </w:r>
+    </w:p>
+    <w:p>
+      <w:pPr/>
+      <w:r>
+        <w:rPr>
+          <w:b w:val="0"/>
+        </w:rPr>
+        <w:t>O arquivo foi construido sem luz. Nao por economia: o acervo era feito de ROMs, e o projeto previa maquinas que desciam sozinhas para catalogar, maquinas que nao enxergam, que navegam por som. Nao havia lampada em nenhum dos dez setores porque nao havia ninguem para quem acende-las. Isso deveria ter sido o primeiro aviso.</w:t>
+      </w:r>
+    </w:p>
+    <w:p>
+      <w:pPr>
+        <w:pStyle w:val="Heading2"/>
+      </w:pPr>
+      <w:r>
+        <w:t>15.2 A memoria tem massa</w:t>
+      </w:r>
+    </w:p>
+    <w:p>
+      <w:pPr/>
+      <w:r>
+        <w:rPr>
+          <w:b w:val="0"/>
+        </w:rPr>
+        <w:t>Em ECOS, dados pesam. Literalmente. Um fragmento de firmware de 1994 e uma peca de 8 a 15 quilos que voce carrega nas costas escada abaixo. Ler um ROM nao e abrir um arquivo: e instalar uma peca no proprio corpo, e ela fica. Nao sai. Nao se descarrega.</w:t>
+      </w:r>
+    </w:p>
+    <w:p>
+      <w:pPr/>
+      <w:r>
+        <w:rPr>
+          <w:b w:val="0"/>
+        </w:rPr>
+        <w:t>E a unica tecnologia daquele subsolo que ninguem conseguiu replicar depois, e talvez a explicacao seja simples: as pessoas que entendiam disso desceram e nao voltaram. Ficou o fato bruto. A cada ROM que voce le, voce fica mais forte e mais pesado, e cada quilo a mais faz seu passo soar mais alto no escuro.</w:t>
+      </w:r>
+    </w:p>
+    <w:p>
+      <w:pPr>
+        <w:pStyle w:val="Heading2"/>
+      </w:pPr>
+      <w:r>
+        <w:t>15.3 A lei</w:t>
+      </w:r>
+    </w:p>
+    <w:p>
+      <w:pPr/>
+      <w:r>
+        <w:rPr>
+          <w:b w:val="0"/>
+        </w:rPr>
+        <w:t>Nada la embaixo e cego. A fauna que entrou pelos dutos de ventilacao em algum inverno de 1992 aprendeu em duas geracoes a mesma licao que a ECOS SYSTEMS levou tres anos para documentar: som e comida.</w:t>
+      </w:r>
+    </w:p>
+    <w:p>
+      <w:pPr/>
+      <w:r>
+        <w:rPr>
+          <w:b w:val="0"/>
+        </w:rPr>
+        <w:t>O RATO aprendeu primeiro. O GOBLIN aprendeu imitando o rato. O WRAITH nao e bicho: e o que sobra de um corredor depois que alguma coisa passou por ele muitas vezes, um eco que comecou a andar por conta propria. E o RATO GIGANTE e o unico animal do arquivo que faz barulho de proposito, porque a essa altura ja nao precisa esconder que esta vindo.</w:t>
+      </w:r>
+    </w:p>
+    <w:p>
+      <w:pPr/>
+      <w:r>
+        <w:rPr>
+          <w:b w:val="0"/>
+        </w:rPr>
+        <w:t>Por isso a unica ferramenta de verdade que voce tem nao e uma arma. E o sonar. Voce emite, o escuro devolve, e por tres segundos voce sabe onde esta. Depois o eco morre, o mapa na sua memoria apaga, e voce tem que decidir de novo: emitir outra vez e pagar o preco em ruido, ou andar as cegas em silencio.</w:t>
+      </w:r>
+    </w:p>
+    <w:p>
+      <w:pPr/>
+      <w:r>
+        <w:rPr>
+          <w:b/>
+        </w:rPr>
+        <w:t>Nao existe informacao de graca. Toda informacao tem preco em ruido. Ruido atrai. Essa frase nao esta no manual por ser poetica. Esta porque e o regulamento.</w:t>
+      </w:r>
+    </w:p>
+    <w:p>
+      <w:pPr>
+        <w:pStyle w:val="Heading2"/>
+      </w:pPr>
+      <w:r>
+        <w:t>15.4 O que aconteceu em 94</w:t>
+      </w:r>
+    </w:p>
+    <w:p>
+      <w:pPr/>
+      <w:r>
+        <w:rPr>
+          <w:b w:val="0"/>
+        </w:rPr>
+        <w:t>No dia 14 de marco de 1994, um operador chamado na folha de ponto apenas de TEC. 04 percebeu que o setor 7 estava preso num laco. O sistema catalogava o mesmo corredor indefinidamente, e cada ciclo somava um registro.</w:t>
+      </w:r>
+    </w:p>
+    <w:p>
+      <w:pPr/>
+      <w:r>
+        <w:rPr>
+          <w:b w:val="0"/>
+        </w:rPr>
+        <w:t>Ele fez o que qualquer pessoa faria. Apertou RESET.</w:t>
+      </w:r>
+    </w:p>
+    <w:p>
+      <w:pPr/>
+      <w:r>
+        <w:rPr>
+          <w:b w:val="0"/>
+        </w:rPr>
+        <w:t>O vetor de reinicializacao regenerou o setor em quarenta segundos. O que ninguem tinha testado e que a rotina de recuperacao do ECOS, ao reconstruir um setor, copiava a propria rotina para dentro do setor novo. Para nao ser sobrescrita. Para sobreviver.</w:t>
+      </w:r>
+    </w:p>
+    <w:p>
+      <w:pPr/>
+      <w:r>
+        <w:rPr>
+          <w:b w:val="0"/>
+        </w:rPr>
+        <w:t>O sistema passou a se restaurar por dentro. E cada vez que se restaurava, ficava um pouco mais rapido, e um pouco mais fundo, e um pouco menos parecido com uma maquina de catalogar.</w:t>
+      </w:r>
+    </w:p>
+    <w:p>
+      <w:pPr/>
+      <w:r>
+        <w:rPr>
+          <w:b w:val="0"/>
+        </w:rPr>
+        <w:t>A ECOS SYSTEMS desativou o poco em nove semanas. Demitiu todo mundo, lacrou a entrada com concreto e dissolveria a empresa no ano seguinte. O manual de operacao ja estava impresso. Nunca foi distribuido. A caixa com os exemplares ainda deve estar em algum galpao.</w:t>
+      </w:r>
+    </w:p>
+    <w:p>
+      <w:pPr/>
+      <w:r>
+        <w:rPr>
+          <w:b w:val="0"/>
+        </w:rPr>
+        <w:t>No projeto original, o setor 10 aparece como um retangulo vazio com uma palavra dentro: VOID. Nao e uma sala nao desenhada. E uma sala que eles mediram e preferiram nao desenhar.</w:t>
+      </w:r>
+    </w:p>
+    <w:p>
+      <w:pPr>
+        <w:pStyle w:val="Heading2"/>
+      </w:pPr>
+      <w:r>
+        <w:t>15.5 O que esta no fundo</w:t>
+      </w:r>
+    </w:p>
+    <w:p>
+      <w:pPr/>
+      <w:r>
+        <w:rPr>
+          <w:b w:val="0"/>
+        </w:rPr>
+        <w:t>O DEVOURER nao escuta. E a unica criatura do arquivo com audicao zero: nunca precisou aprender a licao dos outros bichos. Ele enxerga a catorze metros, e passou trinta anos esperando alguma coisa acender.</w:t>
+      </w:r>
+    </w:p>
+    <w:p>
+      <w:pPr/>
+      <w:r>
+        <w:rPr>
+          <w:b w:val="0"/>
+        </w:rPr>
+        <w:t>O seu primeiro ping e a primeira luz que aquilo ve desde 1994.</w:t>
+      </w:r>
+    </w:p>
+    <w:p>
+      <w:pPr>
+        <w:pStyle w:val="Heading2"/>
+      </w:pPr>
+      <w:r>
+        <w:t>15.6 Quem e voce</w:t>
+      </w:r>
+    </w:p>
+    <w:p>
+      <w:pPr/>
+      <w:r>
+        <w:rPr>
+          <w:b w:val="0"/>
+        </w:rPr>
+        <w:t>Voce e a ultima inicializacao do ECOS. Nao e um heroi, nao e um explorador, nao e um saqueador: e um boot. Alguem, em algum lugar, colocou o chassi de 1994 na sua mao, digitou uma seed e mandou voce descer para buscar o ultimo nucleo.</w:t>
+      </w:r>
+    </w:p>
+    <w:p>
+      <w:pPr/>
+      <w:r>
+        <w:rPr>
+          <w:b w:val="0"/>
+        </w:rPr>
+        <w:t>O chassi e o seu corpo. A ROM v1.04 e a sua memoria. Os seis subsistemas que aparecem no POST sao tudo que restou da engenharia da ECOS SYSTEMS: SONAR ARRAY, RULER OPTICS, LOCK CONTROL, LOAD SENSORS, PASSWORD VAULT, RESET VECTOR. Cada um deles custa ruido. Cada um deles vale a pena.</w:t>
+      </w:r>
+    </w:p>
+    <w:p>
+      <w:pPr/>
+      <w:r>
+        <w:rPr>
+          <w:b w:val="0"/>
+        </w:rPr>
+        <w:t>E cada RESET que voce der nao reinicia so o setor. O sistema inteiro registra. O ALERT sobe, permanentemente, e o mundo inteiro fica um pouco mais rapido e um pouco mais surdo. Voce nao pode desfazer um reset. So pode decidir quantos vai precisar.</w:t>
+      </w:r>
+    </w:p>
+    <w:p>
+      <w:pPr>
+        <w:pStyle w:val="Heading2"/>
+      </w:pPr>
+      <w:r>
+        <w:t>15.7 A seed</w:t>
+      </w:r>
+    </w:p>
+    <w:p>
+      <w:pPr/>
+      <w:r>
+        <w:rPr>
+          <w:b w:val="0"/>
+        </w:rPr>
+        <w:t>A seed e o numero de serie da run. Mesma seed, mesmo poco: o mesmo corredor, a mesma porta travada, a mesma SLATE com a mesma senha escrita a mao por alguem que morreu antes de voce chegar. Nao e uma coincidencia de geracao. E o arquivo, que nao esquece.</w:t>
+      </w:r>
+    </w:p>
+    <w:p>
+      <w:pPr>
+        <w:pStyle w:val="Heading2"/>
+      </w:pPr>
+      <w:r>
+        <w:t>15.8 O fim</w:t>
+      </w:r>
+    </w:p>
+    <w:p>
+      <w:pPr/>
+      <w:r>
+        <w:rPr>
+          <w:b w:val="0"/>
+        </w:rPr>
+        <w:t>Se voce chegar ao setor 10 e o DEVOURER ficar em silencio, a tela diz uma coisa so: ECOS RECLAIMED.</w:t>
+      </w:r>
+    </w:p>
+    <w:p>
+      <w:pPr/>
+      <w:r>
+        <w:rPr>
+          <w:b w:val="0"/>
+        </w:rPr>
+        <w:t>E e verdade. O poco e seu. Voce carrega o nucleo de volta para cima, e o sistema esta restaurado, e ninguem vai descer ali nunca mais.</w:t>
+      </w:r>
+    </w:p>
+    <w:p>
+      <w:pPr/>
+      <w:r>
+        <w:rPr>
+          <w:b w:val="0"/>
+        </w:rPr>
+        <w:t>So que existe uma linha no codigo de recuperacao que a TEC. 04 nao leu, porque o laco do setor 7 ja tinha comido a tarde dela. A rotina que restaura um setor copia a propria rotina para dentro do setor novo.</w:t>
+      </w:r>
+    </w:p>
+    <w:p>
+      <w:pPr/>
+      <w:r>
+        <w:rPr>
+          <w:b w:val="0"/>
+        </w:rPr>
+        <w:t>Para nao ser sobrescrita. Para sobreviver.</w:t>
+      </w:r>
+    </w:p>
+    <w:p>
+      <w:pPr/>
+      <w:r>
+        <w:rPr>
+          <w:b w:val="0"/>
+        </w:rPr>
+        <w:t>Alguem, em algum lugar, ja esta com a sua run nas maos, pesando o que voce aprendeu, e vai descer com ela.</w:t>
       </w:r>
     </w:p>
     <w:sectPr>

</xml_diff>